<commit_message>
docs: documentação atualizada com o repositório no GitHub
Co-Authored-By: Claude Opus 5.5 <noreply@anthropic.com>
</commit_message>
<xml_diff>
--- a/docs/Documentacao-Coroinhas.docx
+++ b/docs/Documentacao-Coroinhas.docx
@@ -1005,14 +1005,7 @@
               <w:spacing w:after="0"/>
             </w:pPr>
             <w:r>
-              <w:t xml:space="preserve">O projeto </w:t>
-            </w:r>
-            <w:r>
-              <w:rPr>
-                <w:b/>
-                <w:bCs/>
-              </w:rPr>
-              <w:t xml:space="preserve">ainda não é um repositório git</w:t>
+              <w:t xml:space="preserve">git + GitHub: https://github.com/marcus-paixao/coroinhas (público, branch main)</w:t>
             </w:r>
           </w:p>
         </w:tc>
@@ -12569,6 +12562,70 @@
               <w:spacing w:after="0"/>
             </w:pPr>
             <w:r>
+              <w:t xml:space="preserve">Projeto enviado ao GitHub (</w:t>
+            </w:r>
+            <w:r>
+              <w:rPr>
+                <w:rFonts w:ascii="Consolas" w:cs="Consolas" w:eastAsia="Consolas" w:hAnsi="Consolas"/>
+                <w:color w:val="12215F"/>
+                <w:sz w:val="19"/>
+                <w:szCs w:val="19"/>
+              </w:rPr>
+              <w:t xml:space="preserve">marcus-paixao/coroinhas</w:t>
+            </w:r>
+            <w:r>
+              <w:t xml:space="preserve">). Os nomes reais da equipe que estavam nos testes foram trocados por nomes fictícios.</w:t>
+            </w:r>
+          </w:p>
+        </w:tc>
+      </w:tr>
+      <w:tr>
+        <w:tc>
+          <w:tcPr>
+            <w:tcW w:type="dxa" w:w="1500"/>
+            <w:tcBorders>
+              <w:top w:val="single" w:color="C5D3FF" w:sz="4"/>
+              <w:left w:val="single" w:color="C5D3FF" w:sz="4"/>
+              <w:bottom w:val="single" w:color="C5D3FF" w:sz="4"/>
+              <w:right w:val="single" w:color="C5D3FF" w:sz="4"/>
+            </w:tcBorders>
+            <w:tcMar>
+              <w:top w:type="dxa" w:w="60"/>
+              <w:left w:type="dxa" w:w="100"/>
+              <w:bottom w:type="dxa" w:w="60"/>
+              <w:right w:type="dxa" w:w="100"/>
+            </w:tcMar>
+          </w:tcPr>
+          <w:p>
+            <w:pPr>
+              <w:spacing w:after="0"/>
+            </w:pPr>
+            <w:r>
+              <w:t xml:space="preserve">28/10/2026</w:t>
+            </w:r>
+          </w:p>
+        </w:tc>
+        <w:tc>
+          <w:tcPr>
+            <w:tcW w:type="dxa" w:w="8138"/>
+            <w:tcBorders>
+              <w:top w:val="single" w:color="C5D3FF" w:sz="4"/>
+              <w:left w:val="single" w:color="C5D3FF" w:sz="4"/>
+              <w:bottom w:val="single" w:color="C5D3FF" w:sz="4"/>
+              <w:right w:val="single" w:color="C5D3FF" w:sz="4"/>
+            </w:tcBorders>
+            <w:tcMar>
+              <w:top w:type="dxa" w:w="60"/>
+              <w:left w:type="dxa" w:w="100"/>
+              <w:bottom w:type="dxa" w:w="60"/>
+              <w:right w:type="dxa" w:w="100"/>
+            </w:tcMar>
+          </w:tcPr>
+          <w:p>
+            <w:pPr>
+              <w:spacing w:after="0"/>
+            </w:pPr>
+            <w:r>
               <w:t xml:space="preserve">Layout de </w:t>
             </w:r>
             <w:r>
@@ -12684,7 +12741,17 @@
         <w:spacing w:after="60"/>
       </w:pPr>
       <w:r>
-        <w:t xml:space="preserve">Versionar o projeto com git, sem incluir </w:t>
+        <w:t xml:space="preserve">O repositório no GitHub é </w:t>
+      </w:r>
+      <w:r>
+        <w:rPr>
+          <w:b/>
+          <w:bCs/>
+        </w:rPr>
+        <w:t xml:space="preserve">público</w:t>
+      </w:r>
+      <w:r>
+        <w:t xml:space="preserve">: nunca suba </w:t>
       </w:r>
       <w:r>
         <w:rPr>
@@ -12696,7 +12763,7 @@
         <w:t xml:space="preserve">dados/</w:t>
       </w:r>
       <w:r>
-        <w:t xml:space="preserve"> (já no .gitignore) nem </w:t>
+        <w:t xml:space="preserve">, planilhas, backups </w:t>
       </w:r>
       <w:r>
         <w:rPr>
@@ -12705,10 +12772,10 @@
           <w:sz w:val="19"/>
           <w:szCs w:val="19"/>
         </w:rPr>
-        <w:t xml:space="preserve">apk/assinatura/</w:t>
-      </w:r>
-      <w:r>
-        <w:t xml:space="preserve"> (já no </w:t>
+        <w:t xml:space="preserve">.json</w:t>
+      </w:r>
+      <w:r>
+        <w:t xml:space="preserve"> ou </w:t>
       </w:r>
       <w:r>
         <w:rPr>
@@ -12717,10 +12784,10 @@
           <w:sz w:val="19"/>
           <w:szCs w:val="19"/>
         </w:rPr>
-        <w:t xml:space="preserve">apk/.gitignore</w:t>
-      </w:r>
-      <w:r>
-        <w:t xml:space="preserve">).</w:t>
+        <w:t xml:space="preserve">apk/assinatura/</w:t>
+      </w:r>
+      <w:r>
+        <w:t xml:space="preserve"> (já estão no .gitignore), e use só nomes fictícios nos testes.</w:t>
       </w:r>
     </w:p>
     <w:p>
@@ -12794,7 +12861,22 @@
           <w:sz w:val="19"/>
           <w:szCs w:val="19"/>
         </w:rPr>
-        <w:t xml:space="preserve">Pasta: C:\Users\mvim_\OneDrive\Desktop\Codes\Projetos\Coroinhas (Windows, sem git).</w:t>
+        <w:t xml:space="preserve">Pasta: C:\Users\mvim_\OneDrive\Desktop\Codes\Projetos\Coroinhas (Windows).</w:t>
+      </w:r>
+    </w:p>
+    <w:p>
+      <w:pPr>
+        <w:shd w:fill="F3F6FF" w:color="auto" w:val="clear"/>
+        <w:spacing w:before="0" w:after="0"/>
+        <w:ind w:left="200" w:right="200"/>
+      </w:pPr>
+      <w:r>
+        <w:rPr>
+          <w:rFonts w:ascii="Consolas" w:cs="Consolas" w:eastAsia="Consolas" w:hAnsi="Consolas"/>
+          <w:sz w:val="19"/>
+          <w:szCs w:val="19"/>
+        </w:rPr>
+        <w:t xml:space="preserve">GitHub: https://github.com/marcus-paixao/coroinhas (público; nada de dados reais).</w:t>
       </w:r>
     </w:p>
     <w:p>

</xml_diff>